<commit_message>
feat: add GRC routes, standard enablement controller, and service
</commit_message>
<xml_diff>
--- a/grc_wisdom_api/scripts/verify/_tmp_reports/Annual_plan.docx
+++ b/grc_wisdom_api/scripts/verify/_tmp_reports/Annual_plan.docx
@@ -272,7 +272,7 @@
                 <w:sz w:val="17"/>
                 <w:szCs w:val="17"/>
               </w:rPr>
-              <w:t xml:space="preserve">2026-08-17 15:43 UTC</w:t>
+              <w:t xml:space="preserve">2026-09-23 10:59 UTC</w:t>
             </w:r>
           </w:p>
         </w:tc>
@@ -330,6 +330,63 @@
                 <w:szCs w:val="17"/>
               </w:rPr>
               <w:t xml:space="preserve">SUBTREE</w:t>
+            </w:r>
+          </w:p>
+        </w:tc>
+      </w:tr>
+      <w:tr>
+        <w:tc>
+          <w:tcPr>
+            <w:tcW w:type="pct" w:w="28%"/>
+            <w:tcBorders>
+              <w:top w:val="single" w:color="E1E7EF" w:sz="1"/>
+              <w:left w:val="single" w:color="E1E7EF" w:sz="1"/>
+              <w:bottom w:val="single" w:color="E1E7EF" w:sz="1"/>
+              <w:right w:val="single" w:color="E1E7EF" w:sz="1"/>
+            </w:tcBorders>
+            <w:shd w:fill="F5F7FA" w:color="auto" w:val="clear"/>
+            <w:tcMar>
+              <w:top w:type="dxa" w:w="60"/>
+              <w:left w:type="dxa" w:w="90"/>
+              <w:bottom w:type="dxa" w:w="60"/>
+              <w:right w:type="dxa" w:w="90"/>
+            </w:tcMar>
+          </w:tcPr>
+          <w:p>
+            <w:r>
+              <w:rPr>
+                <w:color w:val="646F85"/>
+                <w:sz w:val="17"/>
+                <w:szCs w:val="17"/>
+              </w:rPr>
+              <w:t xml:space="preserve">Document reference</w:t>
+            </w:r>
+          </w:p>
+        </w:tc>
+        <w:tc>
+          <w:tcPr>
+            <w:tcW w:type="pct" w:w="72%"/>
+            <w:tcBorders>
+              <w:top w:val="single" w:color="E1E7EF" w:sz="1"/>
+              <w:left w:val="single" w:color="E1E7EF" w:sz="1"/>
+              <w:bottom w:val="single" w:color="E1E7EF" w:sz="1"/>
+              <w:right w:val="single" w:color="E1E7EF" w:sz="1"/>
+            </w:tcBorders>
+            <w:tcMar>
+              <w:top w:type="dxa" w:w="60"/>
+              <w:left w:type="dxa" w:w="90"/>
+              <w:bottom w:type="dxa" w:w="60"/>
+              <w:right w:type="dxa" w:w="90"/>
+            </w:tcMar>
+          </w:tcPr>
+          <w:p>
+            <w:r>
+              <w:rPr>
+                <w:color w:val="0B1524"/>
+                <w:sz w:val="17"/>
+                <w:szCs w:val="17"/>
+              </w:rPr>
+              <w:t xml:space="preserve">1906-20260923105958</w:t>
             </w:r>
           </w:p>
         </w:tc>
@@ -828,7 +885,7 @@
                 <w:sz w:val="17"/>
                 <w:szCs w:val="17"/>
               </w:rPr>
-              <w:t xml:space="preserve">Mahmoud Abdulaziz</w:t>
+              <w:t xml:space="preserve">Mehdi Tantaoui</w:t>
             </w:r>
           </w:p>
         </w:tc>
@@ -938,7 +995,7 @@
                 <w:sz w:val="17"/>
                 <w:szCs w:val="17"/>
               </w:rPr>
-              <w:t xml:space="preserve">Third-party and cloud management</w:t>
+              <w:t xml:space="preserve">Procure to pay</w:t>
             </w:r>
           </w:p>
         </w:tc>
@@ -965,7 +1022,7 @@
                 <w:sz w:val="17"/>
                 <w:szCs w:val="17"/>
               </w:rPr>
-              <w:t xml:space="preserve">ThirdParty</w:t>
+              <w:t xml:space="preserve">Process</w:t>
             </w:r>
           </w:p>
         </w:tc>
@@ -992,7 +1049,7 @@
                 <w:sz w:val="17"/>
                 <w:szCs w:val="17"/>
               </w:rPr>
-              <w:t xml:space="preserve">4.95</w:t>
+              <w:t xml:space="preserve">3.85</w:t>
             </w:r>
           </w:p>
         </w:tc>
@@ -1019,7 +1076,7 @@
                 <w:sz w:val="17"/>
                 <w:szCs w:val="17"/>
               </w:rPr>
-              <w:t xml:space="preserve">High</w:t>
+              <w:t xml:space="preserve">Medium</w:t>
             </w:r>
           </w:p>
         </w:tc>
@@ -1046,7 +1103,7 @@
                 <w:sz w:val="17"/>
                 <w:szCs w:val="17"/>
               </w:rPr>
-              <w:t xml:space="preserve">160</w:t>
+              <w:t xml:space="preserve">100</w:t>
             </w:r>
           </w:p>
         </w:tc>
@@ -1073,7 +1130,7 @@
                 <w:sz w:val="17"/>
                 <w:szCs w:val="17"/>
               </w:rPr>
-              <w:t xml:space="preserve">Mahmoud Abdulaziz</w:t>
+              <w:t xml:space="preserve">Mehdi Tantaoui</w:t>
             </w:r>
           </w:p>
         </w:tc>
@@ -1127,7 +1184,7 @@
                 <w:sz w:val="17"/>
                 <w:szCs w:val="17"/>
               </w:rPr>
-              <w:t xml:space="preserve">Risk tier High (score 4.95). Never audited.</w:t>
+              <w:t xml:space="preserve">Risk tier Medium (score 3.85).</w:t>
             </w:r>
           </w:p>
         </w:tc>
@@ -1183,7 +1240,7 @@
                 <w:sz w:val="17"/>
                 <w:szCs w:val="17"/>
               </w:rPr>
-              <w:t xml:space="preserve">Procure to pay</w:t>
+              <w:t xml:space="preserve">Third-party and cloud management</w:t>
             </w:r>
           </w:p>
         </w:tc>
@@ -1210,7 +1267,7 @@
                 <w:sz w:val="17"/>
                 <w:szCs w:val="17"/>
               </w:rPr>
-              <w:t xml:space="preserve">Process</w:t>
+              <w:t xml:space="preserve">ThirdParty</w:t>
             </w:r>
           </w:p>
         </w:tc>
@@ -1237,7 +1294,7 @@
                 <w:sz w:val="17"/>
                 <w:szCs w:val="17"/>
               </w:rPr>
-              <w:t xml:space="preserve">3.85</w:t>
+              <w:t xml:space="preserve">4.95</w:t>
             </w:r>
           </w:p>
         </w:tc>
@@ -1264,7 +1321,7 @@
                 <w:sz w:val="17"/>
                 <w:szCs w:val="17"/>
               </w:rPr>
-              <w:t xml:space="preserve">Medium</w:t>
+              <w:t xml:space="preserve">High</w:t>
             </w:r>
           </w:p>
         </w:tc>
@@ -1291,7 +1348,7 @@
                 <w:sz w:val="17"/>
                 <w:szCs w:val="17"/>
               </w:rPr>
-              <w:t xml:space="preserve">100</w:t>
+              <w:t xml:space="preserve">160</w:t>
             </w:r>
           </w:p>
         </w:tc>
@@ -1318,7 +1375,7 @@
                 <w:sz w:val="17"/>
                 <w:szCs w:val="17"/>
               </w:rPr>
-              <w:t xml:space="preserve">Mahmoud Abdulaziz</w:t>
+              <w:t xml:space="preserve">Mehdi Tantaoui</w:t>
             </w:r>
           </w:p>
         </w:tc>
@@ -1372,7 +1429,7 @@
                 <w:sz w:val="17"/>
                 <w:szCs w:val="17"/>
               </w:rPr>
-              <w:t xml:space="preserve">Risk tier Medium (score 3.85).</w:t>
+              <w:t xml:space="preserve">Risk tier High (score 4.95). Never audited.</w:t>
             </w:r>
           </w:p>
         </w:tc>
@@ -1428,7 +1485,7 @@
                 <w:sz w:val="17"/>
                 <w:szCs w:val="17"/>
               </w:rPr>
-              <w:t xml:space="preserve">Personal data processing</w:t>
+              <w:t xml:space="preserve">Treasury and cash management</w:t>
             </w:r>
           </w:p>
         </w:tc>
@@ -1482,7 +1539,7 @@
                 <w:sz w:val="17"/>
                 <w:szCs w:val="17"/>
               </w:rPr>
-              <w:t xml:space="preserve">4.5</w:t>
+              <w:t xml:space="preserve">3.83</w:t>
             </w:r>
           </w:p>
         </w:tc>
@@ -1509,7 +1566,7 @@
                 <w:sz w:val="17"/>
                 <w:szCs w:val="17"/>
               </w:rPr>
-              <w:t xml:space="preserve">High</w:t>
+              <w:t xml:space="preserve">Medium</w:t>
             </w:r>
           </w:p>
         </w:tc>
@@ -1536,7 +1593,7 @@
                 <w:sz w:val="17"/>
                 <w:szCs w:val="17"/>
               </w:rPr>
-              <w:t xml:space="preserve">160</w:t>
+              <w:t xml:space="preserve">100</w:t>
             </w:r>
           </w:p>
         </w:tc>
@@ -1563,7 +1620,7 @@
                 <w:sz w:val="17"/>
                 <w:szCs w:val="17"/>
               </w:rPr>
-              <w:t xml:space="preserve">Mahmoud Abdulaziz</w:t>
+              <w:t xml:space="preserve">Mehdi Tantaoui</w:t>
             </w:r>
           </w:p>
         </w:tc>
@@ -1617,7 +1674,7 @@
                 <w:sz w:val="17"/>
                 <w:szCs w:val="17"/>
               </w:rPr>
-              <w:t xml:space="preserve">Risk tier High (score 4.5). Never audited.</w:t>
+              <w:t xml:space="preserve">Risk tier Medium (score 3.83).</w:t>
             </w:r>
           </w:p>
         </w:tc>
@@ -1673,7 +1730,7 @@
                 <w:sz w:val="17"/>
                 <w:szCs w:val="17"/>
               </w:rPr>
-              <w:t xml:space="preserve">Treasury and cash management</w:t>
+              <w:t xml:space="preserve">Personal data processing</w:t>
             </w:r>
           </w:p>
         </w:tc>
@@ -1727,7 +1784,7 @@
                 <w:sz w:val="17"/>
                 <w:szCs w:val="17"/>
               </w:rPr>
-              <w:t xml:space="preserve">3.83</w:t>
+              <w:t xml:space="preserve">4.5</w:t>
             </w:r>
           </w:p>
         </w:tc>
@@ -1754,7 +1811,7 @@
                 <w:sz w:val="17"/>
                 <w:szCs w:val="17"/>
               </w:rPr>
-              <w:t xml:space="preserve">Medium</w:t>
+              <w:t xml:space="preserve">High</w:t>
             </w:r>
           </w:p>
         </w:tc>
@@ -1781,7 +1838,7 @@
                 <w:sz w:val="17"/>
                 <w:szCs w:val="17"/>
               </w:rPr>
-              <w:t xml:space="preserve">100</w:t>
+              <w:t xml:space="preserve">160</w:t>
             </w:r>
           </w:p>
         </w:tc>
@@ -1808,7 +1865,7 @@
                 <w:sz w:val="17"/>
                 <w:szCs w:val="17"/>
               </w:rPr>
-              <w:t xml:space="preserve">Mahmoud Abdulaziz</w:t>
+              <w:t xml:space="preserve">Mehdi Tantaoui</w:t>
             </w:r>
           </w:p>
         </w:tc>
@@ -1862,7 +1919,7 @@
                 <w:sz w:val="17"/>
                 <w:szCs w:val="17"/>
               </w:rPr>
-              <w:t xml:space="preserve">Risk tier Medium (score 3.83).</w:t>
+              <w:t xml:space="preserve">Risk tier High (score 4.5). Never audited.</w:t>
             </w:r>
           </w:p>
         </w:tc>
@@ -2053,7 +2110,7 @@
                 <w:sz w:val="17"/>
                 <w:szCs w:val="17"/>
               </w:rPr>
-              <w:t xml:space="preserve">Mahmoud Abdulaziz</w:t>
+              <w:t xml:space="preserve">Mehdi Tantaoui</w:t>
             </w:r>
           </w:p>
         </w:tc>
@@ -2298,7 +2355,7 @@
                 <w:sz w:val="17"/>
                 <w:szCs w:val="17"/>
               </w:rPr>
-              <w:t xml:space="preserve">Mahmoud Abdulaziz</w:t>
+              <w:t xml:space="preserve">Mehdi Tantaoui</w:t>
             </w:r>
           </w:p>
         </w:tc>
@@ -2408,7 +2465,7 @@
                 <w:sz w:val="17"/>
                 <w:szCs w:val="17"/>
               </w:rPr>
-              <w:t xml:space="preserve">Payroll and HR operations</w:t>
+              <w:t xml:space="preserve">Core banking platform</w:t>
             </w:r>
           </w:p>
         </w:tc>
@@ -2435,7 +2492,7 @@
                 <w:sz w:val="17"/>
                 <w:szCs w:val="17"/>
               </w:rPr>
-              <w:t xml:space="preserve">Process</w:t>
+              <w:t xml:space="preserve">System</w:t>
             </w:r>
           </w:p>
         </w:tc>
@@ -2462,7 +2519,7 @@
                 <w:sz w:val="17"/>
                 <w:szCs w:val="17"/>
               </w:rPr>
-              <w:t xml:space="preserve">3.5</w:t>
+              <w:t xml:space="preserve">4.3</w:t>
             </w:r>
           </w:p>
         </w:tc>
@@ -2489,7 +2546,7 @@
                 <w:sz w:val="17"/>
                 <w:szCs w:val="17"/>
               </w:rPr>
-              <w:t xml:space="preserve">Medium</w:t>
+              <w:t xml:space="preserve">High</w:t>
             </w:r>
           </w:p>
         </w:tc>
@@ -2516,7 +2573,7 @@
                 <w:sz w:val="17"/>
                 <w:szCs w:val="17"/>
               </w:rPr>
-              <w:t xml:space="preserve">100</w:t>
+              <w:t xml:space="preserve">160</w:t>
             </w:r>
           </w:p>
         </w:tc>
@@ -2543,7 +2600,7 @@
                 <w:sz w:val="17"/>
                 <w:szCs w:val="17"/>
               </w:rPr>
-              <w:t xml:space="preserve">Mahmoud Abdulaziz</w:t>
+              <w:t xml:space="preserve">Mehdi Tantaoui</w:t>
             </w:r>
           </w:p>
         </w:tc>
@@ -2597,7 +2654,7 @@
                 <w:sz w:val="17"/>
                 <w:szCs w:val="17"/>
               </w:rPr>
-              <w:t xml:space="preserve">Risk tier Medium (score 3.5).</w:t>
+              <w:t xml:space="preserve">Risk tier High (score 4.3).</w:t>
             </w:r>
           </w:p>
         </w:tc>
@@ -2653,7 +2710,7 @@
                 <w:sz w:val="17"/>
                 <w:szCs w:val="17"/>
               </w:rPr>
-              <w:t xml:space="preserve">Core banking platform</w:t>
+              <w:t xml:space="preserve">Payroll and HR operations</w:t>
             </w:r>
           </w:p>
         </w:tc>
@@ -2680,7 +2737,7 @@
                 <w:sz w:val="17"/>
                 <w:szCs w:val="17"/>
               </w:rPr>
-              <w:t xml:space="preserve">System</w:t>
+              <w:t xml:space="preserve">Process</w:t>
             </w:r>
           </w:p>
         </w:tc>
@@ -2707,7 +2764,7 @@
                 <w:sz w:val="17"/>
                 <w:szCs w:val="17"/>
               </w:rPr>
-              <w:t xml:space="preserve">4.3</w:t>
+              <w:t xml:space="preserve">3.5</w:t>
             </w:r>
           </w:p>
         </w:tc>
@@ -2734,7 +2791,7 @@
                 <w:sz w:val="17"/>
                 <w:szCs w:val="17"/>
               </w:rPr>
-              <w:t xml:space="preserve">High</w:t>
+              <w:t xml:space="preserve">Medium</w:t>
             </w:r>
           </w:p>
         </w:tc>
@@ -2761,7 +2818,7 @@
                 <w:sz w:val="17"/>
                 <w:szCs w:val="17"/>
               </w:rPr>
-              <w:t xml:space="preserve">160</w:t>
+              <w:t xml:space="preserve">100</w:t>
             </w:r>
           </w:p>
         </w:tc>
@@ -2788,7 +2845,7 @@
                 <w:sz w:val="17"/>
                 <w:szCs w:val="17"/>
               </w:rPr>
-              <w:t xml:space="preserve">Mahmoud Abdulaziz</w:t>
+              <w:t xml:space="preserve">Mehdi Tantaoui</w:t>
             </w:r>
           </w:p>
         </w:tc>
@@ -2842,7 +2899,7 @@
                 <w:sz w:val="17"/>
                 <w:szCs w:val="17"/>
               </w:rPr>
-              <w:t xml:space="preserve">Risk tier High (score 4.3).</w:t>
+              <w:t xml:space="preserve">Risk tier Medium (score 3.5).</w:t>
             </w:r>
           </w:p>
         </w:tc>
@@ -2859,7 +2916,7 @@
           <w:sz w:val="15"/>
           <w:szCs w:val="15"/>
         </w:rPr>
-        <w:t xml:space="preserve">Annual Audit Plan · OmniOps · generated 2026-08-17</w:t>
+        <w:t xml:space="preserve">Annual Audit Plan · OmniOps · generated 2026-09-23</w:t>
       </w:r>
     </w:p>
     <w:sectPr>

</xml_diff>

<commit_message>
docs: add QA traceability, defect register, test plan, and verification report artifacts
</commit_message>
<xml_diff>
--- a/grc_wisdom_api/scripts/verify/_tmp_reports/Annual_plan.docx
+++ b/grc_wisdom_api/scripts/verify/_tmp_reports/Annual_plan.docx
@@ -272,7 +272,7 @@
                 <w:sz w:val="17"/>
                 <w:szCs w:val="17"/>
               </w:rPr>
-              <w:t xml:space="preserve">2026-09-23 10:59 UTC</w:t>
+              <w:t xml:space="preserve">2026-09-24 22:36 UTC</w:t>
             </w:r>
           </w:p>
         </w:tc>
@@ -386,7 +386,7 @@
                 <w:sz w:val="17"/>
                 <w:szCs w:val="17"/>
               </w:rPr>
-              <w:t xml:space="preserve">1906-20260923105958</w:t>
+              <w:t xml:space="preserve">B7C7-20260924223635</w:t>
             </w:r>
           </w:p>
         </w:tc>
@@ -2916,7 +2916,7 @@
           <w:sz w:val="15"/>
           <w:szCs w:val="15"/>
         </w:rPr>
-        <w:t xml:space="preserve">Annual Audit Plan · OmniOps · generated 2026-09-23</w:t>
+        <w:t xml:space="preserve">Annual Audit Plan · OmniOps · generated 2026-09-24</w:t>
       </w:r>
     </w:p>
     <w:sectPr>

</xml_diff>